<commit_message>
Reframe the appearance-partition passage around its measurement
The passage described the appearance-based partition as barely working, called
one of its numbers the wrong way, and said only the tail improves, which reads
as an account of something going badly rather than of a measurement being
taken.

What happened is that the partition effect was measured against a random
control instead of assumed, and the measurement showed the residual similarity
is a property of the dataset rather than of the partitioning strategy. That is
the finding, and the passage now says so: mean 0.743 to 0.761, p95 0.915 to
0.907, maximum 0.978 to 0.954, the tail tightens and the centre holds, and
validation scores here carry that optimism whatever the split.

Split into two paragraphs, since the measurement and its interpretation are
separate points.
</commit_message>
<xml_diff>
--- a/posts/Chactun_Multiclass_M2_blog_090226v10.docx
+++ b/posts/Chactun_Multiclass_M2_blog_090226v10.docx
@@ -816,7 +816,7 @@
     </w:p>
     <w:p>
       <w:r>
-        <w:t xml:space="preserve">The substitute blocks on </w:t>
+        <w:t xml:space="preserve">The substitute partitions on </w:t>
       </w:r>
       <w:r>
         <w:rPr>
@@ -825,16 +825,21 @@
         <w:t>appearance</w:t>
       </w:r>
       <w:r>
-        <w:t xml:space="preserve">— cluster the tiles, assign whole clusters to one side — and it barely works. Against a random control it moves cross-split similarity from 0.743 to 0.761 (the wrong way), p95 from 0.915 to 0.907, max from 0.978 to 0.954. Only the tail improves. Chactún tiles are homogeneous enough that every validation tile has a near-twin in training under any partition. </w:t>
+        <w:t>: cluster the tiles, then assign whole clusters to one side. Its effect was measured against a random control rather than assumed. Mean cross-split similarity moves from 0.743 to 0.761, p95 from 0.915 to 0.907, and the maximum from 0.978 to 0.954 — the tail tightens, the centre holds.</w:t>
+      </w:r>
+    </w:p>
+    <w:p>
+      <w:r>
+        <w:t xml:space="preserve">That measurement is itself the finding. Chactún tiles resemble one another closely enough that every validation tile has a near-twin in training under any partition, so the residual similarity is a property of the dataset rather than of the partitioning strategy. </w:t>
       </w:r>
       <w:r>
         <w:rPr>
           <w:b/>
         </w:rPr>
-        <w:t>Validation scores on this dataset are optimistic however it is cut</w:t>
+        <w:t>Validation scores here carry that optimism whatever the split</w:t>
       </w:r>
       <w:r>
-        <w:t>, and that belongs in the results rather than a footnote.</w:t>
+        <w:t>, which is why it is stated in the results rather than left to a footnote.</w:t>
       </w:r>
     </w:p>
     <w:p>

</xml_diff>

<commit_message>
Rewrite the anchor-scale paragraph for a general reader
The paragraph assumed the reader knows what an anchor is and why 31.8 percent
below 32 px would matter. It now glosses the term as the default minimum
detection box, names the standard remedy of shrinking the anchors an octave,
and reports the outcome as a slight drop within training noise.
</commit_message>
<xml_diff>
--- a/posts/Chactun_Multiclass_M2_blog_090226v10.docx
+++ b/posts/Chactun_Multiclass_M2_blog_090226v10.docx
@@ -1860,16 +1860,7 @@
         <w:t>Anchor scale is ruled out.</w:t>
       </w:r>
       <w:r>
-        <w:t xml:space="preserve">At the 800 px input these configs use, 31.8% of buildings fall below the smallest 32 px anchor — an obvious-looking problem with an obvious-looking fix. Shifting the ladder down an octave gave −0.80 ± 1.07, below the seed noise floor, with </w:t>
-      </w:r>
-      <w:r>
-        <w:rPr>
-          <w:i/>
-        </w:rPr>
-        <w:t xml:space="preserve"> every</w:t>
-      </w:r>
-      <w:r>
-        <w:t xml:space="preserve"> metric negative. It is the fifth mechanism in this project to correlate with the symptom and then not survive ablation — a pattern worth noting in its own right.</w:t>
+        <w:t xml:space="preserve"> At the standard 800 px input resolution, nearly a third (31.8%) of annotated buildings are smaller than 32 pixels — smaller than the model's default minimum detection box (anchor). This is a common problem with a standard solution: shrink the reference anchors down an octave to catch smaller targets. Yet doing so yielded a slight performance drop (−0.80 ± 1.07 AP), well within random training noise, with every metric turning negative. It is the fifth mechanism in this project to align neatly with a theoretical symptom only to fail under empirical testing — a pattern worth noting in its own right.</w:t>
       </w:r>
     </w:p>
     <w:p>

</xml_diff>

<commit_message>
Define D4 on first substantive use
D4 appeared in the arm table with a short gloss but was used unexplained in the
prose where the result is reported. It now reads as the set of eight symmetries
of a square, horizontal and vertical flips with rotations of 90, 180 and 270
degrees, so each training tile is presented in all eight orientations rather
than one.
</commit_message>
<xml_diff>
--- a/posts/Chactun_Multiclass_M2_blog_090226v10.docx
+++ b/posts/Chactun_Multiclass_M2_blog_090226v10.docx
@@ -1931,10 +1931,10 @@
         <w:rPr>
           <w:b/>
         </w:rPr>
-        <w:t>D4 augmentation produced the one measurable gain</w:t>
+        <w:t>D4 data augmentation produced the one measurable gain</w:t>
       </w:r>
       <w:r>
-        <w:t>, and it improved every class: +4.16 segm AP (t = 7.94), AP75 +5.89, building +4.91, platform +4.77, small objects +2.95. All five folds positive. Across roughly 42 tests in this milestone a Bonferroni threshold sits near 0.0012, and arm D's core results survive it while every marginal finding does not.</w:t>
+        <w:t>, and it improved every class. D4 is the set of eight symmetries of a square — horizontal and vertical flips, and rotations of 90°, 180° and 270° — so each training tile is presented in all eight orientations rather than one: +4.16 segm AP (t = 7.94), AP75 +5.89, building +4.91, platform +4.77, small objects +2.95. All five folds positive. Across roughly 42 tests in this milestone a Bonferroni threshold sits near 0.0012, and arm D's core results survive it while every marginal finding does not.</w:t>
       </w:r>
     </w:p>
     <w:p>

</xml_diff>

<commit_message>
Convert the remaining -ise forms to American spelling
rasterise to rasterize, Regularisation to Regularization, and one further
instance. Nouns that are correct as-is were left alone: analysis, emphasis,
optimistic.
</commit_message>
<xml_diff>
--- a/posts/Chactun_Multiclass_M2_blog_090226v10.docx
+++ b/posts/Chactun_Multiclass_M2_blog_090226v10.docx
@@ -1962,7 +1962,7 @@
     </w:p>
     <w:p>
       <w:r>
-        <w:t>The transforms were verified label-preserving rather than assumed: rasterise a tile's polygons, rotate that raster, and compare against the same polygons pushed through the coordinate transform. IoU 1.0000 for all four rotations. A rotation that moves pixels but not coordinates trains silently with every label detached from its object, and nothing downstream flags it.</w:t>
+        <w:t>The transforms were verified label-preserving rather than assumed: rasterize a tile's polygons, rotate that raster, and compare against the same polygons pushed through the coordinate transform. IoU 1.0000 for all four rotations. A rotation that moves pixels but not coordinates trains silently with every label detached from its object, and nothing downstream flags it.</w:t>
       </w:r>
     </w:p>
     <w:p>
@@ -1973,7 +1973,7 @@
         <w:t>The trajectories refine the explanation.</w:t>
       </w:r>
       <w:r>
-        <w:t xml:space="preserve">Regularisation would predict the baseline peaks early and decays. It does decay — but only 1.18 on building, against a 4.91 gain, so it accounts for at most a quarter. The trajectories show the arms identical through iteration 1500, after which the baseline stops improving and arm D does not. The baseline </w:t>
+        <w:t xml:space="preserve">Regularization would predict the baseline peaks early and decays. It does decay — but only 1.18 on building, against a 4.91 gain, so it accounts for at most a quarter. The trajectories show the arms identical through iteration 1500, after which the baseline stops improving and arm D does not. The baseline </w:t>
       </w:r>
       <w:r>
         <w:rPr>
@@ -4134,7 +4134,7 @@
         <w:t>A three-class detector at 92% recall</w:t>
       </w:r>
       <w:r>
-        <w:t>, with its error modes separated per class into detection failure versus classification failure, and its operating characteristics measured as recall against false positives per km² rather than as AP alone.</w:t>
+        <w:t>, with its error modes separated per class into detection failure versus classification failure, and its operating characteriztics measured as recall against false positives per km² rather than as AP alone.</w:t>
       </w:r>
     </w:p>
     <w:p>

</xml_diff>

<commit_message>
Tie the aguada band finding to the withheld DEM
The passage said only that the dataset does not ship negative openness. It now
adds that the band could not be generated either, because the source DEM was
withheld from the release. That connects the aguada result to the same
constraint the portability section reaches, rather than leaving it as a
separate observation about band choice.
</commit_message>
<xml_diff>
--- a/posts/Chactun_Multiclass_M2_blog_090226v10.docx
+++ b/posts/Chactun_Multiclass_M2_blog_090226v10.docx
@@ -3202,44 +3202,7 @@
     </w:p>
     <w:p>
       <w:r>
-        <w:t xml:space="preserve">The cause is a property of the visualization choice. Sky-view factor, positive openness and slope all emphasize </w:t>
-      </w:r>
-      <w:r>
-        <w:rPr>
-          <w:b/>
-        </w:rPr>
-        <w:t>raised</w:t>
-      </w:r>
-      <w:r>
-        <w:t>features; positive openness in particular highlights convex forms. Buildings and platforms are raised structures, so they light up.</w:t>
-      </w:r>
-      <w:r>
-        <w:rPr>
-          <w:b/>
-        </w:rPr>
-        <w:t xml:space="preserve">An aguada is a depression, and the diagnostic visualization for concavity is </w:t>
-      </w:r>
-      <w:r>
-        <w:rPr>
-          <w:i/>
-        </w:rPr>
-      </w:r>
-      <w:r>
-        <w:rPr>
-          <w:b/>
-        </w:rPr>
-        <w:t>negative</w:t>
-      </w:r>
-      <w:r>
-        <w:rPr>
-          <w:i/>
-        </w:rPr>
-      </w:r>
-      <w:r>
-        <w:rPr>
-          <w:b/>
-        </w:rPr>
-        <w:t>openness — which this dataset does not ship.</w:t>
+        <w:t>The cause is a property of the visualization choice. Sky-view factor, positive openness, and slope all emphasize raised features; positive openness in particular highlights convex forms. Buildings and platforms are raised structures, so they light up. An aguada is a depression, and the diagnostic visualization for concavity is negative openness — which the Chactún dataset does not ship, nor could it be generated, as the source DEM was withheld from the release.**</w:t>
       </w:r>
     </w:p>
     <w:p>

</xml_diff>

<commit_message>
Sharpen the ground-extent tiling passage
States the geometry precisely: at 1.0 m a fixed 480 by 480 pixel tile covers
twice the linear distance, 480 m, so target structures shrink to a quarter of
their native pixel area. Ground-extent tiling crops a fixed 240 m window,
matching the native coverage, and resizes to 800 px.

Stops short of claiming independence from source resolution or point density.
Ground-extent tiling normalises scale, not information content: the remaining
third of the penalty is detail the coarser survey never recorded, which the
table immediately below reports. Promising resolution-independence there would
have been contradicted by the next paragraph.
</commit_message>
<xml_diff>
--- a/posts/Chactun_Multiclass_M2_blog_090226v10.docx
+++ b/posts/Chactun_Multiclass_M2_blog_090226v10.docx
@@ -3286,7 +3286,12 @@
         <w:t>ground extent</w:t>
       </w:r>
       <w:r>
-        <w:t xml:space="preserve"> rather than pixel count, which matters more than it sounds. Measured on Chactún, naive fixed-pixel tiling costs about two-thirds of the resolution penalty, because a 1 m survey puts four times the ground in each 480×480 tile and objects shrink accordingly. Tiling in meters holds object size constant and removes that entirely — a 240 m tile resized to 800 px reproduces the training scale whatever the source resolution.</w:t>
+        <w:t xml:space="preserve"> rather than pixel count, which matters more than it sounds. Measured on Chactún, naive fixed-pixel tiling accounts for about two-thirds of the resolution penalty: at 1.0 m resolution a fixed 480×480 pixel tile covers twice the linear distance (480 m), causing target structures to shrink to a quarter of their native pixel area. Tiling by ground extent holds object scale constant — cropping a fixed 240 m ground window, matching Chactún's native spatial coverage, and resizing it to 800 px reproduces the training scale whatever the source resolution.</w:t>
+      </w:r>
+    </w:p>
+    <w:p>
+      <w:r>
+        <w:t>What that does not restore is detail. The remaining third of the penalty is information the coarser survey never recorded, and it is what the table below measures.</w:t>
       </w:r>
     </w:p>
     <w:tbl>

</xml_diff>

<commit_message>
Tighten the tiling passage into one paragraph
Folds the scale-versus-information distinction into the governing clause rather
than trailing it in a second paragraph: tiling by ground extent normalizes
object scale rather than information content, which isolates the remaining
penalty to the detail the coarser survey never recorded.
</commit_message>
<xml_diff>
--- a/posts/Chactun_Multiclass_M2_blog_090226v10.docx
+++ b/posts/Chactun_Multiclass_M2_blog_090226v10.docx
@@ -3286,12 +3286,7 @@
         <w:t>ground extent</w:t>
       </w:r>
       <w:r>
-        <w:t xml:space="preserve"> rather than pixel count, which matters more than it sounds. Measured on Chactún, naive fixed-pixel tiling accounts for about two-thirds of the resolution penalty: at 1.0 m resolution a fixed 480×480 pixel tile covers twice the linear distance (480 m), causing target structures to shrink to a quarter of their native pixel area. Tiling by ground extent holds object scale constant — cropping a fixed 240 m ground window, matching Chactún's native spatial coverage, and resizing it to 800 px reproduces the training scale whatever the source resolution.</w:t>
-      </w:r>
-    </w:p>
-    <w:p>
-      <w:r>
-        <w:t>What that does not restore is detail. The remaining third of the penalty is information the coarser survey never recorded, and it is what the table below measures.</w:t>
+        <w:t xml:space="preserve"> rather than pixel count, which matters more than it sounds. Measured on Chactún, naive fixed-pixel tiling accounts for about two-thirds of the resolution penalty: at 1.0 m resolution, a fixed 480×480 pixel tile covers twice the linear ground distance (480 m), causing target structures to shrink to a quarter of their native pixel area. Tiling by ground extent normalizes object scale rather than information content: cropping a fixed 240 m ground window — matching Chactún's native spatial coverage — and resizing it to 800 px reproduces the expected training geometry across survey resolutions, isolating the remaining penalty to the detail the coarser survey never recorded.</w:t>
       </w:r>
     </w:p>
     <w:tbl>

</xml_diff>

<commit_message>
Name the stretch function and drop the bold emphasis
The stretch reads as the stretch function, which is the thing that cannot be
recovered, and the absent products are folded into the same sentence as the
present ones rather than set off in bold. The emphasis was carrying rhetorical
weight the fact does not need.
</commit_message>
<xml_diff>
--- a/posts/Chactun_Multiclass_M2_blog_090226v10.docx
+++ b/posts/Chactun_Multiclass_M2_blog_090226v10.docx
@@ -3831,13 +3831,7 @@
     </w:p>
     <w:p>
       <w:r>
-        <w:t xml:space="preserve">And the stretch cannot be recovered. Verified against the deposit's file list, Chactún provides ML-ready visualizations, masks, a canopy height model and Sentinel-1/2 imagery. </w:t>
-      </w:r>
-      <w:r>
-        <w:rPr>
-          <w:b/>
-        </w:rPr>
-        <w:t>There is no DEM, no DTM and no point cloud.</w:t>
+        <w:t>And the stretch function cannot be recovered. Verified against the deposit's file list, Chactún provides ML-ready visualizations, masks, a canopy height model, and Sentinel-1/2 imagery, but no DEM, no DTM, and no point cloud data.</w:t>
       </w:r>
     </w:p>
     <w:p>

</xml_diff>

<commit_message>
Label the three dataset limitations and correct what was quantized
The three limitations now carry explicit labels rather than bare bullets: no
source elevation data, quantized 8-bit rendering, fixed visualization
selection.

Corrects what the 8-bit truncation applied to. The DEM had already been
converted into sky-view factor, positive openness and slope before export, so
what was truncated from float precision is those three visualization rasters,
not elevation values. The recoverable quantity is fine gradients within the
visualizations.
</commit_message>
<xml_diff>
--- a/posts/Chactun_Multiclass_M2_blog_090226v10.docx
+++ b/posts/Chactun_Multiclass_M2_blog_090226v10.docx
@@ -3847,10 +3847,10 @@
         <w:rPr>
           <w:b/>
         </w:rPr>
-        <w:t>No elevation data</w:t>
+        <w:t>No source elevation data.</w:t>
       </w:r>
       <w:r>
-        <w:t>, so the visualizations cannot be regenerated</w:t>
+        <w:t xml:space="preserve"> Without the raw DEM or DTM, alternative spatial visualizations cannot be regenerated downstream.</w:t>
       </w:r>
     </w:p>
     <w:p>
@@ -3861,10 +3861,10 @@
         <w:rPr>
           <w:b/>
         </w:rPr>
-        <w:t>8-bit only</w:t>
+        <w:t>Quantized 8-bit rendering.</w:t>
       </w:r>
       <w:r>
-        <w:t>, so the float values are quantized away and cannot be recovered at precision</w:t>
+        <w:t xml:space="preserve"> The three visualization rasters were truncated from float precision at export time, so fine gradients within sky-view factor, positive openness and slope cannot be recovered.</w:t>
       </w:r>
     </w:p>
     <w:p>
@@ -3875,15 +3875,15 @@
         <w:rPr>
           <w:b/>
         </w:rPr>
-        <w:t>Three visualization types</w:t>
+        <w:t>Fixed visualization selection.</w:t>
       </w:r>
       <w:r>
-        <w:t>, committed to at deposit time — no hillshade, no local relief model, and no negative openness, which is precisely what the aguada class needed</w:t>
+        <w:t xml:space="preserve"> The deposit committed permanently to three specific bands, omitting hillshading, local relief models, and negative openness — the precise diagnostic channel required to resolve terrain concavity (aguadas).</w:t>
       </w:r>
     </w:p>
     <w:p>
       <w:r>
-        <w:t>In short: restricted access to the underlying LiDAR recordings. The deposit sits several lossy steps from the source measurement, and a model trained at the end of that chain inherits every restriction with no way to undo any of them.</w:t>
+        <w:t>In short, the deposit sits several lossy steps downstream from the original LiDAR point cloud. A model trained at the end of that processing chain inherits every upstream constraint, with no mechanism to recover the lost spatial signal.</w:t>
       </w:r>
     </w:p>
     <w:p>

</xml_diff>

<commit_message>
Number the dataset limitations and sharpen the quantization item
Numbered rather than bulleted, since the three are referred to individually
elsewhere in the section.

Item two now names what was truncated and to what: floating-point arrays for
sky-view factor, openness and slope, permanently truncated to 8-bit integers at
export, destroying fine continuous variance across those derived features.
</commit_message>
<xml_diff>
--- a/posts/Chactun_Multiclass_M2_blog_090226v10.docx
+++ b/posts/Chactun_Multiclass_M2_blog_090226v10.docx
@@ -3840,9 +3840,9 @@
       </w:r>
     </w:p>
     <w:p>
-      <w:pPr>
-        <w:pStyle w:val="ListBullet"/>
-      </w:pPr>
+      <w:r>
+        <w:t xml:space="preserve">1. </w:t>
+      </w:r>
       <w:r>
         <w:rPr>
           <w:b/>
@@ -3850,27 +3850,27 @@
         <w:t>No source elevation data.</w:t>
       </w:r>
       <w:r>
-        <w:t xml:space="preserve"> Without the raw DEM or DTM, alternative spatial visualizations cannot be regenerated downstream.</w:t>
+        <w:t xml:space="preserve"> Without the underlying DEM or DTM, alternative spatial visualizations cannot be regenerated downstream.</w:t>
       </w:r>
     </w:p>
     <w:p>
-      <w:pPr>
-        <w:pStyle w:val="ListBullet"/>
-      </w:pPr>
+      <w:r>
+        <w:t xml:space="preserve">2. </w:t>
+      </w:r>
       <w:r>
         <w:rPr>
           <w:b/>
         </w:rPr>
-        <w:t>Quantized 8-bit rendering.</w:t>
+        <w:t>Quantized 8-bit visualization exports.</w:t>
       </w:r>
       <w:r>
-        <w:t xml:space="preserve"> The three visualization rasters were truncated from float precision at export time, so fine gradients within sky-view factor, positive openness and slope cannot be recovered.</w:t>
+        <w:t xml:space="preserve"> Floating-point arrays for sky-view factor, openness, and slope were permanently truncated to 8-bit integers at export, destroying fine continuous variance across those derived features.</w:t>
       </w:r>
     </w:p>
     <w:p>
-      <w:pPr>
-        <w:pStyle w:val="ListBullet"/>
-      </w:pPr>
+      <w:r>
+        <w:t xml:space="preserve">3. </w:t>
+      </w:r>
       <w:r>
         <w:rPr>
           <w:b/>

</xml_diff>

<commit_message>
Remove the repetition in the portability analogy
Two consecutive paragraphs both ran the same construction: training across many
renderings would teach the model to attend to shape rather than to one
pipeline. The first now states the principle and stops; the second carries the
method, different stretches and visualizations and blends, and the failure mode
it avoids, keying on one rendering byte patterns, which is the detail that ties
back to the unrecoverable stretch function.
</commit_message>
<xml_diff>
--- a/posts/Chactun_Multiclass_M2_blog_090226v10.docx
+++ b/posts/Chactun_Multiclass_M2_blog_090226v10.docx
@@ -3966,12 +3966,12 @@
     </w:p>
     <w:p>
       <w:r>
-        <w:t>Portability follows the exact same logic, swapping orientation for visualization style. A mound is a mound whichever rendering recipe created it, so training the model across multiple visualization styles would teach it to focus on structural geometry rather than forcing every user to adopt a single pipeline.</w:t>
+        <w:t>Portability follows the exact same logic, swapping orientation for visualization style. A mound is a mound whichever rendering recipe created it.</w:t>
       </w:r>
     </w:p>
     <w:p>
       <w:r>
-        <w:t>Training on the same terrain rendered many different ways — different stretches, visualizations and blends — would teach a model to key on the shape of a relief signature rather than on one rendering's byte patterns.</w:t>
+        <w:t>Training on the same terrain rendered many different ways — different stretches, visualizations and blends — would teach the model to key on the shape of the relief signature rather than on one rendering's byte patterns, instead of requiring every user to adopt a single pipeline.</w:t>
       </w:r>
     </w:p>
     <w:p>

</xml_diff>

<commit_message>
Normalize emphasis spacing by pairing markers
Fixes the seven spacing defects reported in review: structures at, structures.
3,429, prediction. Arm B, hillshade would, statistics were, the characteriztics
misspelling introduced by an over-broad substring substitution, and an orphaned
closing marker left when a bolded sentence was replaced with plain text.

The repair is done by PAIRING the markers rather than by inspecting the
characters beside them. Within a line the markers alternate, so the first opens
and the second closes; an opening marker wants a space before and none after,
and a closing marker the reverse. A neighbour-matching regex cannot tell the
two apart, and an earlier attempt at this stripped the spaces before opening
markers, turning recovers **92% into recovers**92% across the document. That
attempt was reverted rather than patched.

Adds scripts/normalize_emphasis.py. Lines with an odd marker count are reported
and left untouched rather than guessed at.
</commit_message>
<xml_diff>
--- a/posts/Chactun_Multiclass_M2_blog_090226v10.docx
+++ b/posts/Chactun_Multiclass_M2_blog_090226v10.docx
@@ -36,7 +36,7 @@
         <w:t>92% of annotated structures</w:t>
       </w:r>
       <w:r>
-        <w:t>at a survey-appropriate operating point. Six candidate improvements were then tested against it under five-fold cross-validation — 36 training runs, paired comparisons, a measured seed-noise floor and multiple-comparison correction. One produced a replicated gain of</w:t>
+        <w:t xml:space="preserve"> at a survey-appropriate operating point. Six candidate improvements were then tested against it under five-fold cross-validation — 36 training runs, paired comparisons, a measured seed-noise floor and multiple-comparison correction. One produced a replicated gain of </w:t>
       </w:r>
       <w:r>
         <w:rPr>
@@ -72,7 +72,7 @@
         <w:t>Scientific Data</w:t>
       </w:r>
       <w:r>
-        <w:t>10:558, 2023, CC BY 4.0) ships 480×480 tiles at 0.5 m, three bands — sky-view factor, positive openness, slope — with annotations as</w:t>
+        <w:t xml:space="preserve">10:558, 2023, CC BY 4.0) ships 480×480 tiles at 0.5 m, three bands — sky-view factor, positive openness, slope — with annotations as </w:t>
       </w:r>
       <w:r>
         <w:rPr>
@@ -757,7 +757,7 @@
         <w:t>Tile boundaries cut structures.</w:t>
       </w:r>
       <w:r>
-        <w:t xml:space="preserve">3,429 of 9,853 instances touch an edge. Platforms therefore </w:t>
+        <w:t xml:space="preserve"> 3,429 of 9,853 instances touch an edge. Platforms therefore </w:t>
       </w:r>
       <w:r>
         <w:rPr>
@@ -1882,7 +1882,7 @@
         <w:t>Resolution is ruled out as well, and the effect runs counter to the prediction.</w:t>
       </w:r>
       <w:r>
-        <w:t>Arm B ruled out giving small objects</w:t>
+        <w:t xml:space="preserve"> Arm B ruled out giving small objects</w:t>
       </w:r>
       <w:r>
         <w:rPr>
@@ -1957,7 +1957,7 @@
         <w:t>hillshade</w:t>
       </w:r>
       <w:r>
-        <w:t>would not be — a fixed illumination azimuth is baked into the pixels, and the rotated image depicts terrain lit from an angle it never was. The field's most common visualization would have blocked the only intervention that worked here. D4 rather than arbitrary rotation also preserves the cardinal alignment common in Maya architecture, and on square tiles np.rot90 is exact where an affine warp would blur 25 px buildings.</w:t>
+        <w:t xml:space="preserve"> would not be — a fixed illumination azimuth is baked into the pixels, and the rotated image depicts terrain lit from an angle it never was. The field's most common visualization would have blocked the only intervention that worked here. D4 rather than arbitrary rotation also preserves the cardinal alignment common in Maya architecture, and on square tiles np.rot90 is exact where an affine warp would blur 25 px buildings.</w:t>
       </w:r>
     </w:p>
     <w:p>
@@ -1973,7 +1973,7 @@
         <w:t>The trajectories refine the explanation.</w:t>
       </w:r>
       <w:r>
-        <w:t>Regularization would predict the baseline peaks early and decays. It does decay — but only 1.18 on building, against a 4.91 gain, so it accounts for at most a quarter. The trajectories show the arms identical through iteration 1500, after which the baseline stops improving and arm D does not. The baseline</w:t>
+        <w:t xml:space="preserve"> Regularization would predict the baseline peaks early and decays. It does decay — but only 1.18 on building, against a 4.91 gain, so it accounts for at most a quarter. The trajectories show the arms identical through iteration 1500, after which the baseline stops improving and arm D does not. The baseline</w:t>
       </w:r>
       <w:r>
         <w:rPr>
@@ -3202,7 +3202,7 @@
     </w:p>
     <w:p>
       <w:r>
-        <w:t>The cause is a property of the visualization choice. Sky-view factor, positive openness, and slope all emphasize raised features; positive openness in particular highlights convex forms. Buildings and platforms are raised structures, so they light up. An aguada is a depression, and the diagnostic visualization for concavity is negative openness — which the Chactún dataset does not ship, nor could it be generated, as the source DEM was withheld from the release.**</w:t>
+        <w:t>The cause is a property of the visualization choice. Sky-view factor, positive openness, and slope all emphasize raised features; positive openness in particular highlights convex forms. Buildings and platforms are raised structures, so they light up. An aguada is a depression, and the diagnostic visualization for concavity is negative openness — which the Chactún dataset does not ship, nor could it be generated, as the source DEM was withheld from the release.</w:t>
       </w:r>
     </w:p>
     <w:p>
@@ -3808,7 +3808,7 @@
         <w:t>statistics</w:t>
       </w:r>
       <w:r>
-        <w:t>were matched — each band rescaled so its valid pixels carried Chactún's mean and standard deviation — rather than the stretch</w:t>
+        <w:t xml:space="preserve"> were matched — each band rescaled so its valid pixels carried Chactún's mean and standard deviation — rather than the stretch </w:t>
       </w:r>
       <w:r>
         <w:rPr>
@@ -4088,7 +4088,7 @@
         <w:t>A three-class detector at 92% recall</w:t>
       </w:r>
       <w:r>
-        <w:t>, with its error modes separated per class into detection failure versus classification failure, and its operating characteriztics measured as recall against false positives per km² rather than as AP alone.</w:t>
+        <w:t>, with its error modes separated per class into detection failure versus classification failure, and its operating characteristics measured as recall against false positives per km² rather than as AP alone.</w:t>
       </w:r>
     </w:p>
     <w:p>

</xml_diff>

<commit_message>
normalize_emphasis: take --src, handle single-asterisk italics
The script hardcoded an absolute path under /home/benja and the v10 filename,
so it ran on one file on one machine. Take --src instead, and derive the lock
file and the temp directory from it, matching md_to_html.py and md_to_docx.py.

It also paired ** only. Single-asterisk italics have the same failure mode,
which is how "*Scientific Data*10:558" survived the earlier pass. Pairing both
kinds also repaired three malformed italic runs in the post, where an arrow
had absorbed the opening marker: "->* because" is now "-> *because".

The residual-defect scan reported every bold run as a fault, because looking at
the characters beside a marker cannot tell an opening marker from a stray one:
that is the same mistake the pairing approach exists to avoid. Since the pass
is idempotent, a second pass that still changes something is the honest signal,
so report that instead. It reports zero.
</commit_message>
<xml_diff>
--- a/posts/Chactun_Multiclass_M2_blog_090226v10.docx
+++ b/posts/Chactun_Multiclass_M2_blog_090226v10.docx
@@ -1912,13 +1912,13 @@
         <w:t>Resolution is ruled out as well, and the effect runs counter to the prediction.</w:t>
       </w:r>
       <w:r>
-        <w:t xml:space="preserve"> Arm B ruled out giving small objects</w:t>
+        <w:t xml:space="preserve"> Arm B ruled out giving small objects </w:t>
       </w:r>
       <w:r>
         <w:rPr>
           <w:i/>
         </w:rPr>
-        <w:t xml:space="preserve"> anchors</w:t>
+        <w:t>anchors</w:t>
       </w:r>
       <w:r>
         <w:t xml:space="preserve">; arm F tested giving them </w:t>
@@ -2003,13 +2003,13 @@
         <w:t>The trajectories refine the explanation.</w:t>
       </w:r>
       <w:r>
-        <w:t xml:space="preserve"> Regularization would predict the baseline peaks early and decays. It does decay — but only 1.18 on building, against a 4.91 gain, so it accounts for at most a quarter. The trajectories show the arms identical through iteration 1500, after which the baseline stops improving and arm D does not. The baseline</w:t>
+        <w:t xml:space="preserve"> Regularization would predict the baseline peaks early and decays. It does decay — but only 1.18 on building, against a 4.91 gain, so it accounts for at most a quarter. The trajectories show the arms identical through iteration 1500, after which the baseline stops improving and arm D does not. The baseline </w:t>
       </w:r>
       <w:r>
         <w:rPr>
           <w:i/>
         </w:rPr>
-        <w:t xml:space="preserve"> exhausts</w:t>
+        <w:t>exhausts</w:t>
       </w:r>
       <w:r>
         <w:t xml:space="preserve"> what 1,669 tiles can teach it; D4 keeps finding new information because each epoch presents genuinely different views. That also implies arm D was still climbing when training stopped, so +4.16 is a floor rather than the effect size.</w:t>
@@ -3961,22 +3961,22 @@
         <w:t>the model did not transfer</w:t>
       </w:r>
       <w:r>
-        <w:t xml:space="preserve"> →</w:t>
+        <w:t xml:space="preserve"> → </w:t>
       </w:r>
       <w:r>
         <w:rPr>
           <w:i/>
         </w:rPr>
-        <w:t xml:space="preserve"> because its input representation could not be reproduced</w:t>
+        <w:t>because its input representation could not be reproduced</w:t>
       </w:r>
       <w:r>
-        <w:t xml:space="preserve"> →</w:t>
+        <w:t xml:space="preserve"> → </w:t>
       </w:r>
       <w:r>
         <w:rPr>
           <w:i/>
         </w:rPr>
-        <w:t xml:space="preserve"> therefore portability requires either a reproducible input specification, or a model indifferent to the representation it is given.</w:t>
+        <w:t>therefore portability requires either a reproducible input specification, or a model indifferent to the representation it is given.</w:t>
       </w:r>
     </w:p>
     <w:p>

</xml_diff>